<commit_message>
docs: clean up old bizplan drafts and update final versions
Remove obsolete intermediate drafts, update final DOCX/PDF,
add backup folder, and sync closedloop session files.

Co-Authored-By: Claude Opus 4.6 (1M context) <noreply@anthropic.com>
</commit_message>
<xml_diff>
--- a/docs/예창패 실제 제풀용/claudecode/2026년 예비창업패키지 사업계획서_페르소닉AI_보충자료_cc_BM수정.docx
+++ b/docs/예창패 실제 제풀용/claudecode/2026년 예비창업패키지 사업계획서_페르소닉AI_보충자료_cc_BM수정.docx
@@ -743,23 +743,23 @@
           </w:tcPr>
           <w:p>
             <w:r>
-              <w:t>$4.7B~$5.3B</w:t>
-            </w:r>
-          </w:p>
-        </w:tc>
-        <w:tc>
-          <w:tcPr>
-            <w:tcW w:w="0" w:type="auto"/>
-            <w:tcBorders>
-              <w:top w:val="single" w:sz="8" w:space="0" w:color="000000"/>
-              <w:left w:val="single" w:sz="8" w:space="0" w:color="000000"/>
-              <w:bottom w:val="single" w:sz="8" w:space="0" w:color="000000"/>
-              <w:right w:val="single" w:sz="8" w:space="0" w:color="000000"/>
-            </w:tcBorders>
-          </w:tcPr>
-          <w:p>
-            <w:r>
-              <w:t>CAGR 9~14%</w:t>
+              <w:t>약 $5.0B</w:t>
+            </w:r>
+          </w:p>
+        </w:tc>
+        <w:tc>
+          <w:tcPr>
+            <w:tcW w:w="0" w:type="auto"/>
+            <w:tcBorders>
+              <w:top w:val="single" w:sz="8" w:space="0" w:color="000000"/>
+              <w:left w:val="single" w:sz="8" w:space="0" w:color="000000"/>
+              <w:bottom w:val="single" w:sz="8" w:space="0" w:color="000000"/>
+              <w:right w:val="single" w:sz="8" w:space="0" w:color="000000"/>
+            </w:tcBorders>
+          </w:tcPr>
+          <w:p>
+            <w:r>
+              <w:t>CAGR 약 12%</w:t>
             </w:r>
           </w:p>
         </w:tc>
@@ -899,7 +899,7 @@
               <w:rPr>
                 <w:b/>
               </w:rPr>
-              <w:t>$5.2B~$5.9B (약 7.7~8.8조원)</w:t>
+              <w:t>약 $5.5B (약 7.7조원)</w:t>
             </w:r>
           </w:p>
         </w:tc>
@@ -1171,7 +1171,7 @@
           </w:tcPr>
           <w:p>
             <w:r>
-              <w:t>$4.7B~$5.3B</w:t>
+              <w:t>약 $5.0B</w:t>
             </w:r>
           </w:p>
         </w:tc>
@@ -1190,23 +1190,23 @@
               <w:jc w:val="center"/>
             </w:pPr>
             <w:r>
-              <w:t>15~25%</w:t>
-            </w:r>
-          </w:p>
-        </w:tc>
-        <w:tc>
-          <w:tcPr>
-            <w:tcW w:w="0" w:type="auto"/>
-            <w:tcBorders>
-              <w:top w:val="single" w:sz="8" w:space="0" w:color="000000"/>
-              <w:left w:val="single" w:sz="8" w:space="0" w:color="000000"/>
-              <w:bottom w:val="single" w:sz="8" w:space="0" w:color="000000"/>
-              <w:right w:val="single" w:sz="8" w:space="0" w:color="000000"/>
-            </w:tcBorders>
-          </w:tcPr>
-          <w:p>
-            <w:r>
-              <w:t>$0.7B~$1.3B</w:t>
+              <w:t>약 20%</w:t>
+            </w:r>
+          </w:p>
+        </w:tc>
+        <w:tc>
+          <w:tcPr>
+            <w:tcW w:w="0" w:type="auto"/>
+            <w:tcBorders>
+              <w:top w:val="single" w:sz="8" w:space="0" w:color="000000"/>
+              <w:left w:val="single" w:sz="8" w:space="0" w:color="000000"/>
+              <w:bottom w:val="single" w:sz="8" w:space="0" w:color="000000"/>
+              <w:right w:val="single" w:sz="8" w:space="0" w:color="000000"/>
+            </w:tcBorders>
+          </w:tcPr>
+          <w:p>
+            <w:r>
+              <w:t>약 $1.0B</w:t>
             </w:r>
           </w:p>
         </w:tc>
@@ -1288,23 +1288,23 @@
               <w:jc w:val="center"/>
             </w:pPr>
             <w:r>
-              <w:t>40~60%</w:t>
-            </w:r>
-          </w:p>
-        </w:tc>
-        <w:tc>
-          <w:tcPr>
-            <w:tcW w:w="0" w:type="auto"/>
-            <w:tcBorders>
-              <w:top w:val="single" w:sz="8" w:space="0" w:color="000000"/>
-              <w:left w:val="single" w:sz="8" w:space="0" w:color="000000"/>
-              <w:bottom w:val="single" w:sz="8" w:space="0" w:color="000000"/>
-              <w:right w:val="single" w:sz="8" w:space="0" w:color="000000"/>
-            </w:tcBorders>
-          </w:tcPr>
-          <w:p>
-            <w:r>
-              <w:t>$0.2B~$0.3B</w:t>
+              <w:t>약 50%</w:t>
+            </w:r>
+          </w:p>
+        </w:tc>
+        <w:tc>
+          <w:tcPr>
+            <w:tcW w:w="0" w:type="auto"/>
+            <w:tcBorders>
+              <w:top w:val="single" w:sz="8" w:space="0" w:color="000000"/>
+              <w:left w:val="single" w:sz="8" w:space="0" w:color="000000"/>
+              <w:bottom w:val="single" w:sz="8" w:space="0" w:color="000000"/>
+              <w:right w:val="single" w:sz="8" w:space="0" w:color="000000"/>
+            </w:tcBorders>
+          </w:tcPr>
+          <w:p>
+            <w:r>
+              <w:t>약 $0.26B</w:t>
             </w:r>
           </w:p>
         </w:tc>
@@ -1347,13 +1347,12 @@
           <w:bCs/>
           <w:lang w:eastAsia="ko-KR"/>
         </w:rPr>
-        <w:t>① 설문 15~25%</w:t>
-      </w:r>
-      <w:r>
-        <w:rPr>
-          <w:lang w:eastAsia="ko-KR"/>
-        </w:rPr>
-        <w:t>: Qualtrics 2024 조사에서 시장조사자 71%가 "3년 내 합성 응답이 과반이 될 것"이라고 답했다. 다만 규제·인구조사처럼 AI가 대체하기 어려운 영역이 있어서, 이 기대치를 1/3로 깎아 15~25%만 잡았다.</w:t>
+        <w:t>① 설문 약 20%: Qualtrics 2024 조사에서 시장조사자 71%가 "3년 내 합성 응답이 과반이 될 것"이라고 답했다. 다만 규제·인구조사처럼 AI가 대체하기 어려운 영역이 있어서, 이 기대치를 1/3로 깎아 약 20%만 잡았다.</w:t>
+      </w:r>
+      <w:r>
+        <w:rPr>
+          <w:lang w:eastAsia="ko-KR"/>
+        </w:rPr>
       </w:r>
     </w:p>
     <w:p>
@@ -1372,41 +1371,36 @@
           <w:bCs/>
           <w:lang w:eastAsia="ko-KR"/>
         </w:rPr>
-        <w:t>② UX 리서치 40~60%</w:t>
-      </w:r>
-      <w:r>
-        <w:rPr>
-          <w:lang w:eastAsia="ko-KR"/>
-        </w:rPr>
-        <w:t xml:space="preserve">: Maze 2026 기준 </w:t>
+        <w:t>② UX 리서치 약 50%: Maze 2026 기준 리서처 69%가 이미 AI를 쓰고 있고, UX 리서치는 페르소닉 AI의 핵심 영역과 직접 맞닿아 있어 높게 잡되, 카테고리가 아직 초기라 69%보다는 낮춰 약 50%로 설정했다.</w:t>
+      </w:r>
+      <w:r>
+        <w:rPr>
+          <w:lang w:eastAsia="ko-KR"/>
+        </w:rPr>
       </w:r>
       <w:proofErr w:type="spellStart"/>
       <w:r>
         <w:rPr>
           <w:lang w:eastAsia="ko-KR"/>
         </w:rPr>
-        <w:t>리서처</w:t>
       </w:r>
       <w:proofErr w:type="spellEnd"/>
       <w:r>
         <w:rPr>
           <w:lang w:eastAsia="ko-KR"/>
         </w:rPr>
-        <w:t xml:space="preserve"> 69%가 이미 AI를 쓰고 있고, UX 리서치는 </w:t>
       </w:r>
       <w:proofErr w:type="spellStart"/>
       <w:r>
         <w:rPr>
           <w:lang w:eastAsia="ko-KR"/>
         </w:rPr>
-        <w:t>페르소닉</w:t>
       </w:r>
       <w:proofErr w:type="spellEnd"/>
       <w:r>
         <w:rPr>
           <w:lang w:eastAsia="ko-KR"/>
         </w:rPr>
-        <w:t xml:space="preserve"> AI의 핵심 영역과 직접 맞닿아 있어 높게 잡되, 카테고리가 아직 초기라 69%보다는 낮춰 40~60%로 설정했다.</w:t>
       </w:r>
     </w:p>
     <w:p>
@@ -1445,7 +1439,7 @@
           <w:bCs/>
           <w:lang w:eastAsia="ko-KR"/>
         </w:rPr>
-        <w:t>SOM: 합성 페르소나 카테고리는 주요 4~5개사에 $163M 이상이 투자된 형성 초기 시장이다. 지배적 플레이어가 아직 없으므로, SAM의 약 5%인 $45M~$82M(약 630억~1,148억원)을 3~5년 내 획득 가능 시장으로 설정하였다.</w:t>
+        <w:t>SOM: 합성 페르소나 카테고리는 주요 4~5개사에 $163M 이상이 투자된 형성 초기 시장이다. 지배적 플레이어가 아직 없으므로, SAM의 약 5%인 약 $63M(약 882억원)을 3~5년 내 획득 가능 시장으로 설정하였다.</w:t>
       </w:r>
     </w:p>
     <w:p>
@@ -1463,7 +1457,7 @@
         <w:rPr>
           <w:lang w:eastAsia="ko-KR"/>
         </w:rPr>
-        <w:t>29년 매출 목표 $10.5M은 SOM 하한($45M)의 약 23%로, SOM 달성을 향한 초기 단계에 해당한다.</w:t>
+        <w:t>29년 매출 목표 $5M(약 70억원)은 SOM(약 $63M)의 약 8%로, SOM 달성을 향한 초기 단계에 해당한다.</w:t>
       </w:r>
     </w:p>
     <w:p>
@@ -1529,7 +1523,7 @@
           <w:b/>
           <w:lang w:eastAsia="ko-KR"/>
         </w:rPr>
-        <w:t xml:space="preserve">전략적 </w:t>
+        <w:t>전략적 총기회: 보수적 TAM + 확장 전환 = 약 $13.1B(약 18.3조원)</w:t>
       </w:r>
       <w:proofErr w:type="spellStart"/>
       <w:r>
@@ -1537,7 +1531,6 @@
           <w:b/>
           <w:lang w:eastAsia="ko-KR"/>
         </w:rPr>
-        <w:t>총기회</w:t>
       </w:r>
       <w:proofErr w:type="spellEnd"/>
       <w:r>
@@ -1545,7 +1538,6 @@
           <w:b/>
           <w:lang w:eastAsia="ko-KR"/>
         </w:rPr>
-        <w:t>: 보수적 TAM + 확장 전환 = $12.8B~$13.5B(약 19~20.1조원)</w:t>
       </w:r>
     </w:p>
     <w:p>

</xml_diff>